<commit_message>
Update contact email; fix resume header so the GitHub link clears the photo
Co-Authored-By: Claude Sonnet 5.5 <noreply@anthropic.com>
</commit_message>
<xml_diff>
--- a/Javed_Akhtar_Resume.docx
+++ b/Javed_Akhtar_Resume.docx
@@ -2,154 +2,204 @@
 <file path=word/document.xml><?xml version="1.0" encoding="utf-8"?>
 <w:document xmlns:wpc="http://schemas.microsoft.com/office/word/2010/wordprocessingCanvas" xmlns:mc="http://schemas.openxmlformats.org/markup-compatibility/2006" xmlns:o="urn:schemas-microsoft-com:office:office" xmlns:r="http://schemas.openxmlformats.org/officeDocument/2006/relationships" xmlns:m="http://schemas.openxmlformats.org/officeDocument/2006/math" xmlns:v="urn:schemas-microsoft-com:vml" xmlns:wp14="http://schemas.microsoft.com/office/word/2010/wordprocessingDrawing" xmlns:wp="http://schemas.openxmlformats.org/drawingml/2006/wordprocessingDrawing" xmlns:w10="urn:schemas-microsoft-com:office:word" xmlns:w="http://schemas.openxmlformats.org/wordprocessingml/2006/main" xmlns:w14="http://schemas.microsoft.com/office/word/2010/wordml" xmlns:w15="http://schemas.microsoft.com/office/word/2012/wordml" xmlns:wpg="http://schemas.microsoft.com/office/word/2010/wordprocessingGroup" xmlns:wpi="http://schemas.microsoft.com/office/word/2010/wordprocessingInk" xmlns:wne="http://schemas.microsoft.com/office/word/2006/wordml" xmlns:wps="http://schemas.microsoft.com/office/word/2010/wordprocessingShape" xmlns:cx="http://schemas.microsoft.com/office/drawing/2014/chartex" xmlns:cx1="http://schemas.microsoft.com/office/drawing/2015/9/8/chartex" xmlns:cx2="http://schemas.microsoft.com/office/drawing/2015/10/21/chartex" xmlns:cx3="http://schemas.microsoft.com/office/drawing/2016/5/9/chartex" xmlns:cx4="http://schemas.microsoft.com/office/drawing/2016/5/10/chartex" xmlns:cx5="http://schemas.microsoft.com/office/drawing/2016/5/11/chartex" xmlns:cx6="http://schemas.microsoft.com/office/drawing/2016/5/12/chartex" xmlns:cx7="http://schemas.microsoft.com/office/drawing/2016/5/13/chartex" xmlns:cx8="http://schemas.microsoft.com/office/drawing/2016/5/14/chartex" xmlns:aink="http://schemas.microsoft.com/office/drawing/2016/ink" xmlns:am3d="http://schemas.microsoft.com/office/drawing/2017/model3d" xmlns:w16cex="http://schemas.microsoft.com/office/word/2018/wordml/cex" xmlns:w16cid="http://schemas.microsoft.com/office/word/2016/wordml/cid" xmlns:w16="http://schemas.microsoft.com/office/word/2018/wordml" xmlns:w16sdtdh="http://schemas.microsoft.com/office/word/2020/wordml/sdtdatahash" xmlns:w16se="http://schemas.microsoft.com/office/word/2015/wordml/symex" mc:Ignorable="w14 w15 wp14">
   <w:body>
-    <w:p>
-      <w:pPr>
-        <w:spacing w:after="20"/>
-      </w:pPr>
-      <w:r>
-        <w:drawing>
-          <wp:anchor distT="0" distB="0" distL="0" distR="0" simplePos="0" allowOverlap="0" behindDoc="0" locked="0" layoutInCell="1" relativeHeight="1076325">
-            <wp:simplePos x="0" y="0"/>
-            <wp:positionH relativeFrom="margin">
-              <wp:align>right</wp:align>
-            </wp:positionH>
-            <wp:positionV relativeFrom="paragraph">
-              <wp:posOffset>0</wp:posOffset>
-            </wp:positionV>
-            <wp:extent cx="800100" cy="1076325"/>
-            <wp:effectExtent t="0" r="0" b="0" l="0"/>
-            <wp:wrapSquare wrapText="left" distT="0" distB="0" distL="0" distR="0"/>
-            <wp:docPr id="1" name="photo" descr="Javed Akhtar" title="Photo"/>
-            <wp:cNvGraphicFramePr>
-              <a:graphicFrameLocks xmlns:a="http://schemas.openxmlformats.org/drawingml/2006/main" noChangeAspect="1"/>
-            </wp:cNvGraphicFramePr>
-            <a:graphic xmlns:a="http://schemas.openxmlformats.org/drawingml/2006/main">
-              <a:graphicData uri="http://schemas.openxmlformats.org/drawingml/2006/picture">
-                <pic:pic xmlns:pic="http://schemas.openxmlformats.org/drawingml/2006/picture">
-                  <pic:nvPicPr>
-                    <pic:cNvPr id="0" name="" descr=""/>
-                    <pic:cNvPicPr>
-                      <a:picLocks noChangeAspect="1" noChangeArrowheads="1"/>
-                    </pic:cNvPicPr>
-                  </pic:nvPicPr>
-                  <pic:blipFill>
-                    <a:blip r:embed="rId7" cstate="none"/>
-                    <a:srcRect/>
-                    <a:stretch>
-                      <a:fillRect/>
-                    </a:stretch>
-                  </pic:blipFill>
-                  <pic:spPr bwMode="auto">
-                    <a:xfrm>
-                      <a:off x="0" y="0"/>
-                      <a:ext cx="800100" cy="1076325"/>
-                    </a:xfrm>
-                    <a:prstGeom prst="rect">
-                      <a:avLst/>
-                    </a:prstGeom>
-                  </pic:spPr>
-                </pic:pic>
-              </a:graphicData>
-            </a:graphic>
-          </wp:anchor>
-        </w:drawing>
-      </w:r>
-      <w:r>
-        <w:rPr>
-          <w:rFonts w:ascii="Calibri" w:cs="Calibri" w:eastAsia="Calibri" w:hAnsi="Calibri"/>
-          <w:b/>
-          <w:bCs/>
-          <w:color w:val="0B3D2E"/>
-          <w:sz w:val="44"/>
-          <w:szCs w:val="44"/>
-        </w:rPr>
-        <w:t xml:space="preserve">Javed Akhtar</w:t>
-      </w:r>
-    </w:p>
-    <w:p>
-      <w:pPr>
-        <w:spacing w:after="40"/>
-      </w:pPr>
-      <w:r>
-        <w:rPr>
-          <w:rFonts w:ascii="Calibri" w:cs="Calibri" w:eastAsia="Calibri" w:hAnsi="Calibri"/>
-          <w:b/>
-          <w:bCs/>
-          <w:sz w:val="21"/>
-          <w:szCs w:val="21"/>
-        </w:rPr>
-        <w:t xml:space="preserve">Senior Director of Customer Service · AI-First CX &amp; Operations Leader</w:t>
-      </w:r>
-    </w:p>
-    <w:p>
-      <w:r>
-        <w:rPr>
-          <w:rFonts w:ascii="Calibri" w:cs="Calibri" w:eastAsia="Calibri" w:hAnsi="Calibri"/>
-          <w:color w:val="444444"/>
-          <w:sz w:val="19"/>
-          <w:szCs w:val="19"/>
-        </w:rPr>
-        <w:t xml:space="preserve">Bengaluru, Karnataka</w:t>
-      </w:r>
-      <w:r>
-        <w:rPr>
-          <w:rFonts w:ascii="Calibri" w:cs="Calibri" w:eastAsia="Calibri" w:hAnsi="Calibri"/>
-          <w:color w:val="444444"/>
-          <w:sz w:val="19"/>
-          <w:szCs w:val="19"/>
-        </w:rPr>
-        <w:t xml:space="preserve">  |  </w:t>
-      </w:r>
-      <w:r>
-        <w:rPr>
-          <w:rFonts w:ascii="Calibri" w:cs="Calibri" w:eastAsia="Calibri" w:hAnsi="Calibri"/>
-          <w:color w:val="444444"/>
-          <w:sz w:val="19"/>
-          <w:szCs w:val="19"/>
-        </w:rPr>
-        <w:t xml:space="preserve">javed.akhtar@codingal.com</w:t>
-      </w:r>
-      <w:r>
-        <w:rPr>
-          <w:rFonts w:ascii="Calibri" w:cs="Calibri" w:eastAsia="Calibri" w:hAnsi="Calibri"/>
-          <w:color w:val="444444"/>
-          <w:sz w:val="19"/>
-          <w:szCs w:val="19"/>
-        </w:rPr>
-        <w:t xml:space="preserve">  |  </w:t>
-      </w:r>
-      <w:hyperlink w:history="1" r:id="rIdwyupg0tvoj1silhj8-r5j">
-        <w:r>
-          <w:rPr>
-            <w:rFonts w:ascii="Calibri" w:cs="Calibri" w:eastAsia="Calibri" w:hAnsi="Calibri"/>
-            <w:color w:val="444444"/>
-            <w:sz w:val="19"/>
-            <w:szCs w:val="19"/>
-          </w:rPr>
-          <w:t xml:space="preserve">linkedin.com/in/javed-akhtar-53264a16</w:t>
-        </w:r>
-      </w:hyperlink>
-      <w:r>
-        <w:rPr>
-          <w:rFonts w:ascii="Calibri" w:cs="Calibri" w:eastAsia="Calibri" w:hAnsi="Calibri"/>
-          <w:color w:val="444444"/>
-          <w:sz w:val="19"/>
-          <w:szCs w:val="19"/>
-        </w:rPr>
-        <w:t xml:space="preserve">  |  </w:t>
-      </w:r>
-      <w:hyperlink w:history="1" r:id="rIduovfxmymibjaqbjmvrljg">
-        <w:r>
-          <w:rPr>
-            <w:rFonts w:ascii="Calibri" w:cs="Calibri" w:eastAsia="Calibri" w:hAnsi="Calibri"/>
-            <w:color w:val="444444"/>
-            <w:sz w:val="19"/>
-            <w:szCs w:val="19"/>
-          </w:rPr>
-          <w:t xml:space="preserve">javed-akhtar-siddique.github.io</w:t>
-        </w:r>
-      </w:hyperlink>
-    </w:p>
+    <w:tbl>
+      <w:tblPr>
+        <w:tblW w:type="dxa" w:w="10206"/>
+        <w:tblBorders>
+          <w:top w:val="none" w:color="FFFFFF" w:sz="0"/>
+          <w:left w:val="none" w:color="FFFFFF" w:sz="0"/>
+          <w:bottom w:val="none" w:color="FFFFFF" w:sz="0"/>
+          <w:right w:val="none" w:color="FFFFFF" w:sz="0"/>
+          <w:insideH w:val="none" w:color="FFFFFF" w:sz="0"/>
+          <w:insideV w:val="none" w:color="FFFFFF" w:sz="0"/>
+        </w:tblBorders>
+      </w:tblPr>
+      <w:tblGrid>
+        <w:gridCol w:w="8600"/>
+        <w:gridCol w:w="1606"/>
+      </w:tblGrid>
+      <w:tr>
+        <w:tc>
+          <w:tcPr>
+            <w:tcW w:type="dxa" w:w="8600"/>
+            <w:tcBorders>
+              <w:top w:val="none" w:color="FFFFFF" w:sz="0"/>
+              <w:left w:val="none" w:color="FFFFFF" w:sz="0"/>
+              <w:bottom w:val="none" w:color="FFFFFF" w:sz="0"/>
+              <w:right w:val="none" w:color="FFFFFF" w:sz="0"/>
+            </w:tcBorders>
+            <w:tcMar>
+              <w:top w:type="dxa" w:w="0"/>
+              <w:left w:type="dxa" w:w="0"/>
+              <w:bottom w:type="dxa" w:w="0"/>
+              <w:right w:type="dxa" w:w="0"/>
+            </w:tcMar>
+          </w:tcPr>
+          <w:p>
+            <w:pPr>
+              <w:spacing w:after="20"/>
+            </w:pPr>
+            <w:r>
+              <w:rPr>
+                <w:rFonts w:ascii="Calibri" w:cs="Calibri" w:eastAsia="Calibri" w:hAnsi="Calibri"/>
+                <w:b/>
+                <w:bCs/>
+                <w:color w:val="0B3D2E"/>
+                <w:sz w:val="44"/>
+                <w:szCs w:val="44"/>
+              </w:rPr>
+              <w:t xml:space="preserve">Javed Akhtar</w:t>
+            </w:r>
+          </w:p>
+          <w:p>
+            <w:pPr>
+              <w:spacing w:after="40"/>
+            </w:pPr>
+            <w:r>
+              <w:rPr>
+                <w:rFonts w:ascii="Calibri" w:cs="Calibri" w:eastAsia="Calibri" w:hAnsi="Calibri"/>
+                <w:b/>
+                <w:bCs/>
+                <w:sz w:val="21"/>
+                <w:szCs w:val="21"/>
+              </w:rPr>
+              <w:t xml:space="preserve">Senior Director of Customer Service · AI-First CX &amp; Operations Leader</w:t>
+            </w:r>
+          </w:p>
+          <w:p>
+            <w:r>
+              <w:rPr>
+                <w:rFonts w:ascii="Calibri" w:cs="Calibri" w:eastAsia="Calibri" w:hAnsi="Calibri"/>
+                <w:color w:val="444444"/>
+                <w:sz w:val="19"/>
+                <w:szCs w:val="19"/>
+              </w:rPr>
+              <w:t xml:space="preserve">Bengaluru, Karnataka</w:t>
+            </w:r>
+            <w:r>
+              <w:rPr>
+                <w:rFonts w:ascii="Calibri" w:cs="Calibri" w:eastAsia="Calibri" w:hAnsi="Calibri"/>
+                <w:color w:val="444444"/>
+                <w:sz w:val="19"/>
+                <w:szCs w:val="19"/>
+              </w:rPr>
+              <w:t xml:space="preserve">  |  </w:t>
+            </w:r>
+            <w:r>
+              <w:rPr>
+                <w:rFonts w:ascii="Calibri" w:cs="Calibri" w:eastAsia="Calibri" w:hAnsi="Calibri"/>
+                <w:color w:val="444444"/>
+                <w:sz w:val="19"/>
+                <w:szCs w:val="19"/>
+              </w:rPr>
+              <w:t xml:space="preserve">javed.siddique765@gmail.com</w:t>
+            </w:r>
+            <w:r>
+              <w:rPr>
+                <w:rFonts w:ascii="Calibri" w:cs="Calibri" w:eastAsia="Calibri" w:hAnsi="Calibri"/>
+                <w:color w:val="444444"/>
+                <w:sz w:val="19"/>
+                <w:szCs w:val="19"/>
+              </w:rPr>
+              <w:t xml:space="preserve">  |  </w:t>
+            </w:r>
+            <w:hyperlink w:history="1" r:id="rIdwig89jiwcnu_ezdxwu7ds">
+              <w:r>
+                <w:rPr>
+                  <w:rFonts w:ascii="Calibri" w:cs="Calibri" w:eastAsia="Calibri" w:hAnsi="Calibri"/>
+                  <w:color w:val="444444"/>
+                  <w:sz w:val="19"/>
+                  <w:szCs w:val="19"/>
+                </w:rPr>
+                <w:t xml:space="preserve">linkedin.com/in/javed-akhtar-53264a16</w:t>
+              </w:r>
+            </w:hyperlink>
+            <w:r>
+              <w:rPr>
+                <w:rFonts w:ascii="Calibri" w:cs="Calibri" w:eastAsia="Calibri" w:hAnsi="Calibri"/>
+                <w:color w:val="444444"/>
+                <w:sz w:val="19"/>
+                <w:szCs w:val="19"/>
+              </w:rPr>
+              <w:t xml:space="preserve">  |  </w:t>
+            </w:r>
+            <w:hyperlink w:history="1" r:id="rIdaugxoz-hog5qrrop6x-zk">
+              <w:r>
+                <w:rPr>
+                  <w:rFonts w:ascii="Calibri" w:cs="Calibri" w:eastAsia="Calibri" w:hAnsi="Calibri"/>
+                  <w:color w:val="444444"/>
+                  <w:sz w:val="19"/>
+                  <w:szCs w:val="19"/>
+                </w:rPr>
+                <w:t xml:space="preserve">javed-akhtar-siddique.github.io</w:t>
+              </w:r>
+            </w:hyperlink>
+          </w:p>
+        </w:tc>
+        <w:tc>
+          <w:tcPr>
+            <w:tcW w:type="dxa" w:w="1606"/>
+            <w:tcBorders>
+              <w:top w:val="none" w:color="FFFFFF" w:sz="0"/>
+              <w:left w:val="none" w:color="FFFFFF" w:sz="0"/>
+              <w:bottom w:val="none" w:color="FFFFFF" w:sz="0"/>
+              <w:right w:val="none" w:color="FFFFFF" w:sz="0"/>
+            </w:tcBorders>
+            <w:tcMar>
+              <w:top w:type="dxa" w:w="0"/>
+              <w:left w:type="dxa" w:w="0"/>
+              <w:bottom w:type="dxa" w:w="0"/>
+              <w:right w:type="dxa" w:w="0"/>
+            </w:tcMar>
+          </w:tcPr>
+          <w:p>
+            <w:pPr>
+              <w:jc w:val="right"/>
+            </w:pPr>
+            <w:r>
+              <w:drawing>
+                <wp:inline distT="0" distB="0" distL="0" distR="0">
+                  <wp:extent cx="800100" cy="1076325"/>
+                  <wp:effectExtent t="0" r="0" b="0" l="0"/>
+                  <wp:docPr id="1" name="photo" descr="Javed Akhtar" title="Photo"/>
+                  <wp:cNvGraphicFramePr>
+                    <a:graphicFrameLocks xmlns:a="http://schemas.openxmlformats.org/drawingml/2006/main" noChangeAspect="1"/>
+                  </wp:cNvGraphicFramePr>
+                  <a:graphic xmlns:a="http://schemas.openxmlformats.org/drawingml/2006/main">
+                    <a:graphicData uri="http://schemas.openxmlformats.org/drawingml/2006/picture">
+                      <pic:pic xmlns:pic="http://schemas.openxmlformats.org/drawingml/2006/picture">
+                        <pic:nvPicPr>
+                          <pic:cNvPr id="0" name="" descr=""/>
+                          <pic:cNvPicPr>
+                            <a:picLocks noChangeAspect="1" noChangeArrowheads="1"/>
+                          </pic:cNvPicPr>
+                        </pic:nvPicPr>
+                        <pic:blipFill>
+                          <a:blip r:embed="rId7" cstate="none"/>
+                          <a:srcRect/>
+                          <a:stretch>
+                            <a:fillRect/>
+                          </a:stretch>
+                        </pic:blipFill>
+                        <pic:spPr bwMode="auto">
+                          <a:xfrm>
+                            <a:off x="0" y="0"/>
+                            <a:ext cx="800100" cy="1076325"/>
+                          </a:xfrm>
+                          <a:prstGeom prst="rect">
+                            <a:avLst/>
+                          </a:prstGeom>
+                        </pic:spPr>
+                      </pic:pic>
+                    </a:graphicData>
+                  </a:graphic>
+                </wp:inline>
+              </w:drawing>
+            </w:r>
+          </w:p>
+        </w:tc>
+      </w:tr>
+    </w:tbl>
     <w:p>
       <w:pPr>
         <w:pBdr>

</xml_diff>

<commit_message>
Add phone number; stop contact text breaking mid-word on mobile
Co-Authored-By: Claude Sonnet 5.5 <noreply@anthropic.com>
</commit_message>
<xml_diff>
--- a/Javed_Akhtar_Resume.docx
+++ b/Javed_Akhtar_Resume.docx
@@ -92,6 +92,24 @@
                 <w:sz w:val="19"/>
                 <w:szCs w:val="19"/>
               </w:rPr>
+              <w:t xml:space="preserve">+91-8217541640</w:t>
+            </w:r>
+            <w:r>
+              <w:rPr>
+                <w:rFonts w:ascii="Calibri" w:cs="Calibri" w:eastAsia="Calibri" w:hAnsi="Calibri"/>
+                <w:color w:val="444444"/>
+                <w:sz w:val="19"/>
+                <w:szCs w:val="19"/>
+              </w:rPr>
+              <w:t xml:space="preserve">  |  </w:t>
+            </w:r>
+            <w:r>
+              <w:rPr>
+                <w:rFonts w:ascii="Calibri" w:cs="Calibri" w:eastAsia="Calibri" w:hAnsi="Calibri"/>
+                <w:color w:val="444444"/>
+                <w:sz w:val="19"/>
+                <w:szCs w:val="19"/>
+              </w:rPr>
               <w:t xml:space="preserve">javed.siddique765@gmail.com</w:t>
             </w:r>
             <w:r>
@@ -103,7 +121,7 @@
               </w:rPr>
               <w:t xml:space="preserve">  |  </w:t>
             </w:r>
-            <w:hyperlink w:history="1" r:id="rIdwig89jiwcnu_ezdxwu7ds">
+            <w:hyperlink w:history="1" r:id="rId-1avsq9wn4vvehdtvjbx-">
               <w:r>
                 <w:rPr>
                   <w:rFonts w:ascii="Calibri" w:cs="Calibri" w:eastAsia="Calibri" w:hAnsi="Calibri"/>
@@ -123,7 +141,7 @@
               </w:rPr>
               <w:t xml:space="preserve">  |  </w:t>
             </w:r>
-            <w:hyperlink w:history="1" r:id="rIdaugxoz-hog5qrrop6x-zk">
+            <w:hyperlink w:history="1" r:id="rIdjp1vuhhfauywuia11a7u-">
               <w:r>
                 <w:rPr>
                   <w:rFonts w:ascii="Calibri" w:cs="Calibri" w:eastAsia="Calibri" w:hAnsi="Calibri"/>

</xml_diff>

<commit_message>
Resume: GitHub and LinkedIn links side by side on the second contact line
Co-Authored-By: Claude Sonnet 5.5 <noreply@anthropic.com>
</commit_message>
<xml_diff>
--- a/Javed_Akhtar_Resume.docx
+++ b/Javed_Akhtar_Resume.docx
@@ -112,16 +112,9 @@
               </w:rPr>
               <w:t xml:space="preserve">javed.siddique765@gmail.com</w:t>
             </w:r>
-            <w:r>
-              <w:rPr>
-                <w:rFonts w:ascii="Calibri" w:cs="Calibri" w:eastAsia="Calibri" w:hAnsi="Calibri"/>
-                <w:color w:val="444444"/>
-                <w:sz w:val="19"/>
-                <w:szCs w:val="19"/>
-              </w:rPr>
-              <w:t xml:space="preserve">  |  </w:t>
-            </w:r>
-            <w:hyperlink w:history="1" r:id="rId-1avsq9wn4vvehdtvjbx-">
+          </w:p>
+          <w:p>
+            <w:hyperlink w:history="1" r:id="rId6czpr7zoqqlrxgyqfy3w1">
               <w:r>
                 <w:rPr>
                   <w:rFonts w:ascii="Calibri" w:cs="Calibri" w:eastAsia="Calibri" w:hAnsi="Calibri"/>
@@ -129,7 +122,7 @@
                   <w:sz w:val="19"/>
                   <w:szCs w:val="19"/>
                 </w:rPr>
-                <w:t xml:space="preserve">linkedin.com/in/javed-akhtar-53264a16</w:t>
+                <w:t xml:space="preserve">javed-akhtar-siddique.github.io</w:t>
               </w:r>
             </w:hyperlink>
             <w:r>
@@ -141,7 +134,7 @@
               </w:rPr>
               <w:t xml:space="preserve">  |  </w:t>
             </w:r>
-            <w:hyperlink w:history="1" r:id="rIdjp1vuhhfauywuia11a7u-">
+            <w:hyperlink w:history="1" r:id="rIdf904rn5rufnrzgwewptsj">
               <w:r>
                 <w:rPr>
                   <w:rFonts w:ascii="Calibri" w:cs="Calibri" w:eastAsia="Calibri" w:hAnsi="Calibri"/>
@@ -149,7 +142,7 @@
                   <w:sz w:val="19"/>
                   <w:szCs w:val="19"/>
                 </w:rPr>
-                <w:t xml:space="preserve">javed-akhtar-siddique.github.io</w:t>
+                <w:t xml:space="preserve">linkedin.com/in/javed-akhtar-53264a16</w:t>
               </w:r>
             </w:hyperlink>
           </w:p>

</xml_diff>

<commit_message>
Add onboarding revamp, after-class feedback loop and PTM result
Co-Authored-By: Claude Sonnet 5.5 <noreply@anthropic.com>
</commit_message>
<xml_diff>
--- a/Javed_Akhtar_Resume.docx
+++ b/Javed_Akhtar_Resume.docx
@@ -114,7 +114,7 @@
             </w:r>
           </w:p>
           <w:p>
-            <w:hyperlink w:history="1" r:id="rId6czpr7zoqqlrxgyqfy3w1">
+            <w:hyperlink w:history="1" r:id="rIdpq3dvcqn0ifqt5orerwfe">
               <w:r>
                 <w:rPr>
                   <w:rFonts w:ascii="Calibri" w:cs="Calibri" w:eastAsia="Calibri" w:hAnsi="Calibri"/>
@@ -134,7 +134,7 @@
               </w:rPr>
               <w:t xml:space="preserve">  |  </w:t>
             </w:r>
-            <w:hyperlink w:history="1" r:id="rIdf904rn5rufnrzgwewptsj">
+            <w:hyperlink w:history="1" r:id="rIdkysdriv1icc9vjqjgmcsu">
               <w:r>
                 <w:rPr>
                   <w:rFonts w:ascii="Calibri" w:cs="Calibri" w:eastAsia="Calibri" w:hAnsi="Calibri"/>
@@ -469,6 +469,24 @@
           <w:szCs w:val="20"/>
         </w:rPr>
         <w:t xml:space="preserve">Cut monthly churn from 16% to 9%. Raised trial-to-completion from 44% to 56% and course completion from 15% to 25%.</w:t>
+      </w:r>
+    </w:p>
+    <w:p>
+      <w:pPr>
+        <w:pStyle w:val="ListParagraph"/>
+        <w:numPr>
+          <w:ilvl w:val="0"/>
+          <w:numId w:val="2"/>
+        </w:numPr>
+        <w:spacing w:before="30"/>
+      </w:pPr>
+      <w:r>
+        <w:rPr>
+          <w:rFonts w:ascii="Calibri" w:cs="Calibri" w:eastAsia="Calibri" w:hAnsi="Calibri"/>
+          <w:sz w:val="20"/>
+          <w:szCs w:val="20"/>
+        </w:rPr>
+        <w:t xml:space="preserve">Revamped the customer onboarding process, started an after-class feedback loop and redesigned ticket routing. The parent-teacher meeting (PTM) rate rose to 90%.</w:t>
       </w:r>
     </w:p>
     <w:p>

</xml_diff>